<commit_message>
Growth plan: October goal $10k, add November $20k row
Co-Authored-By: Claude Opus 5.5 <noreply@anthropic.com>
Claude-Session: https://claude.ai/code/session_01D87LwuWDcN4nTXwvgo4Xse
</commit_message>
<xml_diff>
--- a/Coastline_Growth_Plan_50k_100k.docx
+++ b/Coastline_Growth_Plan_50k_100k.docx
@@ -78,7 +78,7 @@
           <w:sz w:val="22"/>
           <w:szCs w:val="22"/>
         </w:rPr>
-        <w:t xml:space="preserve">Grow Coastline Auto Detailing from $15,000 a month in October 2026 to $50,000 a month, then $100,000 a month, by adding $5,000 in monthly revenue every month (stretch: $10,000).</w:t>
+        <w:t xml:space="preserve">Grow Coastline Auto Detailing from $10,000 in October 2026 and $20,000 in November to $50,000 a month, then $100,000 a month, by adding $5,000 in monthly revenue every month after that (stretch: $10,000).</w:t>
       </w:r>
     </w:p>
     <w:tbl>
@@ -246,7 +246,7 @@
                 <w:sz w:val="20"/>
                 <w:szCs w:val="20"/>
               </w:rPr>
-              <w:t xml:space="preserve">$15,000</w:t>
+              <w:t xml:space="preserve">$10,000</w:t>
             </w:r>
           </w:p>
         </w:tc>
@@ -270,7 +270,7 @@
                 <w:sz w:val="20"/>
                 <w:szCs w:val="20"/>
               </w:rPr>
-              <w:t xml:space="preserve">$15,000</w:t>
+              <w:t xml:space="preserve">$10,000</w:t>
             </w:r>
           </w:p>
         </w:tc>
@@ -295,6 +295,104 @@
                 <w:szCs w:val="20"/>
               </w:rPr>
               <w:t xml:space="preserve">Coating ads launch Oct 14</w:t>
+            </w:r>
+          </w:p>
+        </w:tc>
+      </w:tr>
+      <w:tr>
+        <w:tc>
+          <w:tcPr>
+            <w:tcW w:type="dxa" w:w="2600"/>
+            <w:tcMar>
+              <w:top w:type="dxa" w:w="60"/>
+              <w:left w:type="dxa" w:w="100"/>
+              <w:bottom w:type="dxa" w:w="60"/>
+              <w:right w:type="dxa" w:w="100"/>
+            </w:tcMar>
+          </w:tcPr>
+          <w:p>
+            <w:r>
+              <w:rPr>
+                <w:rFonts w:ascii="Arial" w:cs="Arial" w:eastAsia="Arial" w:hAnsi="Arial"/>
+                <w:b w:val="false"/>
+                <w:bCs w:val="false"/>
+                <w:color w:val="000000"/>
+                <w:sz w:val="20"/>
+                <w:szCs w:val="20"/>
+              </w:rPr>
+              <w:t xml:space="preserve">Nov 2026</w:t>
+            </w:r>
+          </w:p>
+        </w:tc>
+        <w:tc>
+          <w:tcPr>
+            <w:tcW w:type="dxa" w:w="2400"/>
+            <w:tcMar>
+              <w:top w:type="dxa" w:w="60"/>
+              <w:left w:type="dxa" w:w="100"/>
+              <w:bottom w:type="dxa" w:w="60"/>
+              <w:right w:type="dxa" w:w="100"/>
+            </w:tcMar>
+          </w:tcPr>
+          <w:p>
+            <w:r>
+              <w:rPr>
+                <w:rFonts w:ascii="Arial" w:cs="Arial" w:eastAsia="Arial" w:hAnsi="Arial"/>
+                <w:b w:val="false"/>
+                <w:bCs w:val="false"/>
+                <w:color w:val="000000"/>
+                <w:sz w:val="20"/>
+                <w:szCs w:val="20"/>
+              </w:rPr>
+              <w:t xml:space="preserve">$20,000</w:t>
+            </w:r>
+          </w:p>
+        </w:tc>
+        <w:tc>
+          <w:tcPr>
+            <w:tcW w:type="dxa" w:w="2400"/>
+            <w:tcMar>
+              <w:top w:type="dxa" w:w="60"/>
+              <w:left w:type="dxa" w:w="100"/>
+              <w:bottom w:type="dxa" w:w="60"/>
+              <w:right w:type="dxa" w:w="100"/>
+            </w:tcMar>
+          </w:tcPr>
+          <w:p>
+            <w:r>
+              <w:rPr>
+                <w:rFonts w:ascii="Arial" w:cs="Arial" w:eastAsia="Arial" w:hAnsi="Arial"/>
+                <w:b w:val="false"/>
+                <w:bCs w:val="false"/>
+                <w:color w:val="000000"/>
+                <w:sz w:val="20"/>
+                <w:szCs w:val="20"/>
+              </w:rPr>
+              <w:t xml:space="preserve">$25,000</w:t>
+            </w:r>
+          </w:p>
+        </w:tc>
+        <w:tc>
+          <w:tcPr>
+            <w:tcW w:type="dxa" w:w="2440"/>
+            <w:tcMar>
+              <w:top w:type="dxa" w:w="60"/>
+              <w:left w:type="dxa" w:w="100"/>
+              <w:bottom w:type="dxa" w:w="60"/>
+              <w:right w:type="dxa" w:w="100"/>
+            </w:tcMar>
+          </w:tcPr>
+          <w:p>
+            <w:r>
+              <w:rPr>
+                <w:rFonts w:ascii="Arial" w:cs="Arial" w:eastAsia="Arial" w:hAnsi="Arial"/>
+                <w:b w:val="false"/>
+                <w:bCs w:val="false"/>
+                <w:color w:val="000000"/>
+                <w:sz w:val="20"/>
+                <w:szCs w:val="20"/>
+              </w:rPr>
+              <w:t xml:space="preserve"/>
             </w:r>
           </w:p>
         </w:tc>
@@ -2040,7 +2138,7 @@
           <w:sz w:val="24"/>
           <w:szCs w:val="24"/>
         </w:rPr>
-        <w:t xml:space="preserve">Stage 1 — $15k to $25k (Oct–Dec 2026)</w:t>
+        <w:t xml:space="preserve">Stage 1 — $10k to $25k (Oct–Dec 2026)</w:t>
       </w:r>
     </w:p>
     <w:p>

</xml_diff>